<commit_message>
Starters: four board errors out, and the one the fix itself introduced
The pack named Edexcel as a GCSE Economics board and cited 1EC0. Pearson does not
offer a domestic GCSE Economics and that code does not exist. Two economics sets
built on the production possibility diagram were tagged for GCSE, and so was a set
on economic systems: neither is in AQA 8136 or OCR J205, so a GCSE class would have
been flagged for intervention on content that cannot appear in their exam. Both are
now Year 12 with a GCSE swap. The outgoing A level codes 7132 and H431 become 7138
and H436, which is what a class starting this September is on.

The independent check then caught something the fix had introduced: the level key
had been rewritten into an absolute claim that is false for one of the seven sets.
Softened back to what the boards actually support.

That is the whole point of the checker being a different agent from the fixer.

Co-Authored-By: Claude Opus 5 <noreply@anthropic.com>
</commit_message>
<xml_diff>
--- a/resources/first-half-term-of-starters/First-Half-Term-Of-Starters-Business-And-Economics-CLEAN-EDITABLE.docx
+++ b/resources/first-half-term-of-starters/First-Half-Term-Of-Starters-Business-And-Economics-CLEAN-EDITABLE.docx
@@ -258,7 +258,7 @@
           <w:b/>
           <w:sz w:val="20"/>
         </w:rPr>
-        <w:t>Built from content common to the early units of the main specifications. Business: AQA, Edexcel, OCR, Eduqas and Cambridge. Economics: AQA, Edexcel and OCR.</w:t>
+        <w:t>Built from content common to the early units of the main specifications. Business: AQA, Edexcel, OCR, Eduqas and Cambridge. Economics: AQA and OCR.</w:t>
       </w:r>
     </w:p>
     <w:p>
@@ -1184,7 +1184,7 @@
               <w:rPr>
                 <w:sz w:val="19"/>
               </w:rPr>
-              <w:t>Opportunity cost and the production possibility diagram</w:t>
+              <w:t>Opportunity cost, and the production possibility diagram at Year 12</w:t>
             </w:r>
           </w:p>
         </w:tc>
@@ -1253,7 +1253,7 @@
               <w:rPr>
                 <w:sz w:val="19"/>
               </w:rPr>
-              <w:t>Specialisation, money and economic systems</w:t>
+              <w:t>Specialisation, money, and economic systems at Year 12</w:t>
             </w:r>
           </w:p>
         </w:tc>
@@ -1782,7 +1782,7 @@
           <w:sz w:val="30"/>
         </w:rPr>
         <w:lastRenderedPageBreak/>
-        <w:t>Levels, boards and the four sets that need a swap</w:t>
+        <w:t>Levels, boards and the seven sets that need a swap</w:t>
       </w:r>
     </w:p>
     <w:p>
@@ -1881,7 +1881,7 @@
               <w:rPr>
                 <w:sz w:val="19"/>
               </w:rPr>
-              <w:t>Works from Year 10 to the first weeks of Year 12. Thirty-eight of the forty-two sets carry this tag. Year 12 students should be answering in fuller sentences, not answering different questions.</w:t>
+              <w:t>Works from Year 10 to the first weeks of Year 12. Thirty-five of the forty-two sets carry this tag. Year 12 students should be answering in fuller sentences, not answering different questions.</w:t>
             </w:r>
           </w:p>
         </w:tc>
@@ -1918,7 +1918,7 @@
               <w:rPr>
                 <w:sz w:val="19"/>
               </w:rPr>
-              <w:t>Needs content a GCSE class will not have met. Four sets carry this tag, all four of them Economics, and every one of them carries a GCSE swap printed underneath it.</w:t>
+              <w:t>Needs content a GCSE class will not have met. Seven sets carry this tag, all seven of them Economics, and every one of them carries a GCSE swap printed underneath it.</w:t>
             </w:r>
           </w:p>
         </w:tc>
@@ -1934,7 +1934,7 @@
           <w:b/>
           <w:sz w:val="23"/>
         </w:rPr>
-        <w:t>The four Year 12 sets, and their swaps</w:t>
+        <w:t>The seven Year 12 sets, and their swaps</w:t>
       </w:r>
     </w:p>
     <w:tbl>
@@ -1985,6 +1985,117 @@
                 <w:sz w:val="19"/>
               </w:rPr>
               <w:t>What makes it Year 12 content</w:t>
+            </w:r>
+          </w:p>
+        </w:tc>
+      </w:tr>
+      <w:tr>
+        <w:trPr>
+          <w:cantSplit/>
+        </w:trPr>
+        <w:tc>
+          <w:tcPr>
+            <w:tcW w:w="3061" w:type="dxa"/>
+          </w:tcPr>
+          <w:p>
+            <w:pPr>
+              <w:spacing w:after="40" w:line="240" w:lineRule="auto"/>
+            </w:pPr>
+            <w:r>
+              <w:rPr>
+                <w:sz w:val="19"/>
+              </w:rPr>
+              <w:t>Economics, Week 2, Starter B</w:t>
+            </w:r>
+          </w:p>
+        </w:tc>
+        <w:tc>
+          <w:tcPr>
+            <w:tcW w:w="7041" w:type="dxa"/>
+          </w:tcPr>
+          <w:p>
+            <w:pPr>
+              <w:spacing w:after="40" w:line="240" w:lineRule="auto"/>
+            </w:pPr>
+            <w:r>
+              <w:rPr>
+                <w:sz w:val="19"/>
+              </w:rPr>
+              <w:t>The production possibility diagram, which is A level content only</w:t>
+            </w:r>
+          </w:p>
+        </w:tc>
+      </w:tr>
+      <w:tr>
+        <w:trPr>
+          <w:cantSplit/>
+        </w:trPr>
+        <w:tc>
+          <w:tcPr>
+            <w:tcW w:w="3061" w:type="dxa"/>
+          </w:tcPr>
+          <w:p>
+            <w:pPr>
+              <w:spacing w:after="40" w:line="240" w:lineRule="auto"/>
+            </w:pPr>
+            <w:r>
+              <w:rPr>
+                <w:sz w:val="19"/>
+              </w:rPr>
+              <w:t>Economics, Week 2, Starter C</w:t>
+            </w:r>
+          </w:p>
+        </w:tc>
+        <w:tc>
+          <w:tcPr>
+            <w:tcW w:w="7041" w:type="dxa"/>
+          </w:tcPr>
+          <w:p>
+            <w:pPr>
+              <w:spacing w:after="40" w:line="240" w:lineRule="auto"/>
+            </w:pPr>
+            <w:r>
+              <w:rPr>
+                <w:sz w:val="19"/>
+              </w:rPr>
+              <w:t>Shifts of the production possibility diagram, and capital goods</w:t>
+            </w:r>
+          </w:p>
+        </w:tc>
+      </w:tr>
+      <w:tr>
+        <w:trPr>
+          <w:cantSplit/>
+        </w:trPr>
+        <w:tc>
+          <w:tcPr>
+            <w:tcW w:w="3061" w:type="dxa"/>
+          </w:tcPr>
+          <w:p>
+            <w:pPr>
+              <w:spacing w:after="40" w:line="240" w:lineRule="auto"/>
+            </w:pPr>
+            <w:r>
+              <w:rPr>
+                <w:sz w:val="19"/>
+              </w:rPr>
+              <w:t>Economics, Week 3, Starter C</w:t>
+            </w:r>
+          </w:p>
+        </w:tc>
+        <w:tc>
+          <w:tcPr>
+            <w:tcW w:w="7041" w:type="dxa"/>
+          </w:tcPr>
+          <w:p>
+            <w:pPr>
+              <w:spacing w:after="40" w:line="240" w:lineRule="auto"/>
+            </w:pPr>
+            <w:r>
+              <w:rPr>
+                <w:sz w:val="19"/>
+              </w:rPr>
+              <w:t>Free market, command and mixed economies, which are A level only</w:t>
             </w:r>
           </w:p>
         </w:tc>
@@ -2381,7 +2492,13 @@
         <w:rPr>
           <w:sz w:val="20"/>
         </w:rPr>
-        <w:t>This pack does not follow one specification. On the Business side it uses content common to the early units of AQA 8132 and 7132, Edexcel 1BS0 and 9BS0, OCR J204 and H431, Eduqas, and Cambridge IGCSE 0450. On the Economics side it uses content common to the early units of AQA 8136 and 7136, Edexcel 1EC0 and 9EC0, and OCR J205 and H460. No board prescribes the order any of it is taught in. Check the order against your own scheme of work rather than against this pack.</w:t>
+        <w:t>This pack does not follow one specification. On the Business side it uses content common to the early units of AQA 8132 and 7138, Edexcel 1BS0 and 9BS0, OCR J204 and H436, Eduqas, and Cambridge IGCSE 0450. AQA 7138 and OCR H436 are for first teaching in September 2026, and a Year 13 group is finishing AQA 7132 or OCR H431, so the content used here is common to both. On the Economics side it uses content common to the early units of AQA 8136 and 7136, OCR J205 and H460, and Edexcel 9EC0 at A level only. Pear</w:t>
+      </w:r>
+      <w:r>
+        <w:rPr>
+          <w:sz w:val="20"/>
+        </w:rPr>
+        <w:t>son Edexcel does not offer a GCSE Economics in England, so the GCSE Economics line carries no Edexcel code. The Edexcel International GCSE in Economics is a separate qualification and is not what this pack is written against. No board prescribes the order any of it is taught in. Check the order against your own scheme of work rather than against this pack.</w:t>
       </w:r>
     </w:p>
     <w:p>
@@ -4066,7 +4183,7 @@
           <w:sz w:val="25"/>
         </w:rPr>
         <w:lastRenderedPageBreak/>
-        <w:t>WEEK 2. Business: enterprise and entrepreneurship. Economics: opportunity cost and the production possibility diagram.</w:t>
+        <w:t>WEEK 2. Business: enterprise and entrepreneurship. Economics: opportunity cost, and the production possibility diagram at Year 12.</w:t>
       </w:r>
     </w:p>
     <w:p>
@@ -5123,7 +5240,7 @@
               <w:rPr>
                 <w:sz w:val="18"/>
               </w:rPr>
-              <w:t>The price is the money handed over. The opportunity cost is what you gave up to have it, which includes things money does not measure, such as time.</w:t>
+              <w:t>The price is the money handed over. The opportunity cost is what you gave up, including time.</w:t>
             </w:r>
           </w:p>
           <w:p>
@@ -5183,7 +5300,7 @@
                 <w:b/>
                 <w:sz w:val="18"/>
               </w:rPr>
-              <w:t>WEEK 2  ·  ECONOMICS  ·  STARTER B      Level: GCSE and Y12</w:t>
+              <w:t>WEEK 2  ·  ECONOMICS  ·  STARTER B      Level: Y12</w:t>
             </w:r>
           </w:p>
           <w:p>
@@ -5272,7 +5389,7 @@
               <w:rPr>
                 <w:sz w:val="19"/>
               </w:rPr>
-              <w:t>An economy moves from 60 units of food and 20 of machinery to 45 of food and 35 of machinery. State the opportunity cost of the extra machinery.</w:t>
+              <w:t>Food output falls from 60 to 45 and machinery rises from 20 to 35. State the opportunity cost.</w:t>
             </w:r>
           </w:p>
           <w:p>
@@ -5353,7 +5470,7 @@
               <w:rPr>
                 <w:sz w:val="18"/>
               </w:rPr>
-              <w:t>Resources are not being used fully or efficiently, so there is spare capacity or unemployment. Output could rise without giving anything up.</w:t>
+              <w:t>Resources are not being used fully or efficiently, so there is spare capacity or unemployment.</w:t>
             </w:r>
           </w:p>
           <w:p>
@@ -5372,7 +5489,7 @@
               <w:rPr>
                 <w:sz w:val="18"/>
               </w:rPr>
-              <w:t>That combination cannot be reached with the resources and technology available now. It becomes possible only if the economy grows.</w:t>
+              <w:t>It cannot be reached with the resources and technology available now, only if the economy grows.</w:t>
             </w:r>
           </w:p>
           <w:p>
@@ -5391,7 +5508,7 @@
               <w:rPr>
                 <w:sz w:val="18"/>
               </w:rPr>
-              <w:t>Food falls from 60 to 45 and machinery rises from 20 to 35, so 15 units of food are given up for 15 extra units of machinery. The opportunity cost is 15 units of food.</w:t>
+              <w:t>15 units of food given up for 15 extra units of machinery. The opportunity cost is 15 units of food.</w:t>
             </w:r>
           </w:p>
           <w:p>
@@ -5410,6 +5527,171 @@
                 <w:sz w:val="18"/>
               </w:rPr>
               <w:t>There is not enough of it to satisfy everyone who wants it at a price of zero.</w:t>
+            </w:r>
+          </w:p>
+        </w:tc>
+      </w:tr>
+    </w:tbl>
+    <w:p>
+      <w:pPr>
+        <w:spacing w:after="6"/>
+        <w:rPr>
+          <w:sz w:val="6"/>
+        </w:rPr>
+      </w:pPr>
+    </w:p>
+    <w:tbl>
+      <w:tblPr>
+        <w:tblStyle w:val="TableGrid"/>
+        <w:tblW w:w="0" w:type="auto"/>
+        <w:tblLayout w:type="fixed"/>
+        <w:tblLook w:val="04A0" w:firstRow="1" w:lastRow="0" w:firstColumn="1" w:lastColumn="0" w:noHBand="0" w:noVBand="1"/>
+      </w:tblPr>
+      <w:tblGrid>
+        <w:gridCol w:w="10103"/>
+      </w:tblGrid>
+      <w:tr>
+        <w:trPr>
+          <w:cantSplit/>
+        </w:trPr>
+        <w:tc>
+          <w:tcPr>
+            <w:tcW w:w="10103" w:type="dxa"/>
+            <w:shd w:val="clear" w:color="auto" w:fill="FAFAFA"/>
+          </w:tcPr>
+          <w:p>
+            <w:pPr>
+              <w:keepNext/>
+              <w:spacing w:after="30" w:line="240" w:lineRule="auto"/>
+            </w:pPr>
+            <w:r>
+              <w:rPr>
+                <w:b/>
+                <w:sz w:val="18"/>
+              </w:rPr>
+              <w:t>GCSE SWAP  2B</w:t>
+            </w:r>
+            <w:r>
+              <w:rPr>
+                <w:sz w:val="18"/>
+              </w:rPr>
+              <w:t xml:space="preserve">  Replace questions 1 to 3 with these. Questions 4 and 5 stay as they are.</w:t>
+            </w:r>
+          </w:p>
+          <w:p>
+            <w:pPr>
+              <w:keepNext/>
+              <w:spacing w:after="10" w:line="240" w:lineRule="auto"/>
+            </w:pPr>
+            <w:r>
+              <w:rPr>
+                <w:b/>
+                <w:sz w:val="18"/>
+              </w:rPr>
+              <w:t xml:space="preserve">(i) </w:t>
+            </w:r>
+            <w:r>
+              <w:rPr>
+                <w:sz w:val="18"/>
+              </w:rPr>
+              <w:t>A council can build a library or a leisure centre on the same plot. State the opportunity cost of choosing the library.</w:t>
+            </w:r>
+          </w:p>
+          <w:p>
+            <w:pPr>
+              <w:keepNext/>
+              <w:spacing w:after="30" w:line="240" w:lineRule="auto"/>
+            </w:pPr>
+            <w:r>
+              <w:rPr>
+                <w:b/>
+                <w:sz w:val="18"/>
+              </w:rPr>
+              <w:t xml:space="preserve">Answer. </w:t>
+            </w:r>
+            <w:r>
+              <w:rPr>
+                <w:i/>
+                <w:sz w:val="18"/>
+              </w:rPr>
+              <w:t>The leisure centre, and the use the town would have had from it.</w:t>
+            </w:r>
+          </w:p>
+          <w:p>
+            <w:pPr>
+              <w:keepNext/>
+              <w:spacing w:after="10" w:line="240" w:lineRule="auto"/>
+            </w:pPr>
+            <w:r>
+              <w:rPr>
+                <w:b/>
+                <w:sz w:val="18"/>
+              </w:rPr>
+              <w:t xml:space="preserve">(ii) </w:t>
+            </w:r>
+            <w:r>
+              <w:rPr>
+                <w:sz w:val="18"/>
+              </w:rPr>
+              <w:t>Why does every economic choice have a cost, even when nothing is paid for?</w:t>
+            </w:r>
+          </w:p>
+          <w:p>
+            <w:pPr>
+              <w:keepNext/>
+              <w:spacing w:after="30" w:line="240" w:lineRule="auto"/>
+            </w:pPr>
+            <w:r>
+              <w:rPr>
+                <w:b/>
+                <w:sz w:val="18"/>
+              </w:rPr>
+              <w:t xml:space="preserve">Answer. </w:t>
+            </w:r>
+            <w:r>
+              <w:rPr>
+                <w:i/>
+                <w:sz w:val="18"/>
+              </w:rPr>
+              <w:t>Because resources are limited. Using them one way means the next best use is given up.</w:t>
+            </w:r>
+          </w:p>
+          <w:p>
+            <w:pPr>
+              <w:keepNext/>
+              <w:spacing w:after="10" w:line="240" w:lineRule="auto"/>
+            </w:pPr>
+            <w:r>
+              <w:rPr>
+                <w:b/>
+                <w:sz w:val="18"/>
+              </w:rPr>
+              <w:t xml:space="preserve">(iii) </w:t>
+            </w:r>
+            <w:r>
+              <w:rPr>
+                <w:sz w:val="18"/>
+              </w:rPr>
+              <w:t>Name one choice you made this week, and state its opportunity cost.</w:t>
+            </w:r>
+          </w:p>
+          <w:p>
+            <w:pPr>
+              <w:spacing w:after="30" w:line="240" w:lineRule="auto"/>
+            </w:pPr>
+            <w:r>
+              <w:rPr>
+                <w:b/>
+                <w:sz w:val="18"/>
+              </w:rPr>
+              <w:t xml:space="preserve">Answer. </w:t>
+            </w:r>
+            <w:r>
+              <w:rPr>
+                <w:i/>
+                <w:sz w:val="18"/>
+              </w:rPr>
+              <w:t>An hour on a game rather than revision. The opportunity cost is the revision you did not do.</w:t>
             </w:r>
           </w:p>
         </w:tc>
@@ -5451,7 +5733,7 @@
                 <w:b/>
                 <w:sz w:val="18"/>
               </w:rPr>
-              <w:t>WEEK 2  ·  ECONOMICS  ·  STARTER C      Level: GCSE and Y12</w:t>
+              <w:t>WEEK 2  ·  ECONOMICS  ·  STARTER C      Level: Y12</w:t>
             </w:r>
           </w:p>
           <w:p>
@@ -5464,7 +5746,7 @@
                 <w:b/>
                 <w:sz w:val="20"/>
               </w:rPr>
-              <w:t>Capital goods, consumer goods and growth</w:t>
+              <w:t>Capital goods, growth and economic choices</w:t>
             </w:r>
           </w:p>
           <w:p>
@@ -5483,7 +5765,7 @@
               <w:rPr>
                 <w:sz w:val="19"/>
               </w:rPr>
-              <w:t>What is the difference between a capital good and a consumer good? Give an example of each.</w:t>
+              <w:t>Name two things that shift the curve outwards.</w:t>
             </w:r>
           </w:p>
           <w:p>
@@ -5502,7 +5784,7 @@
               <w:rPr>
                 <w:sz w:val="19"/>
               </w:rPr>
-              <w:t>Name two things that shift the curve outwards.</w:t>
+              <w:t>Why can a country that builds more capital goods now consume more later?</w:t>
             </w:r>
           </w:p>
           <w:p>
@@ -5521,7 +5803,7 @@
               <w:rPr>
                 <w:sz w:val="19"/>
               </w:rPr>
-              <w:t>Why can a country that builds more capital goods now consume more later?</w:t>
+              <w:t>A flood destroys a third of a country's factories. What happens to the curve?</w:t>
             </w:r>
           </w:p>
           <w:p>
@@ -5540,7 +5822,7 @@
               <w:rPr>
                 <w:sz w:val="19"/>
               </w:rPr>
-              <w:t>A flood destroys a third of a country's factories. What happens to the curve?</w:t>
+              <w:t>A government spends on hospitals rather than schools. Give one benefit and one cost.</w:t>
             </w:r>
           </w:p>
           <w:p>
@@ -5602,7 +5884,7 @@
               <w:rPr>
                 <w:sz w:val="18"/>
               </w:rPr>
-              <w:t>A capital good is used to produce other goods, for example a factory robot. A consumer good is bought to be used, for example a pair of shoes.</w:t>
+              <w:t>Any two of: better technology, more or better educated workers, more capital, higher investment.</w:t>
             </w:r>
           </w:p>
           <w:p>
@@ -5621,7 +5903,7 @@
               <w:rPr>
                 <w:sz w:val="18"/>
               </w:rPr>
-              <w:t>Any two of: better technology, more workers or better educated workers, more capital, discovery of new resources, higher investment.</w:t>
+              <w:t>Capital goods raise future output, so the curve shifts outwards and more can be consumed later.</w:t>
             </w:r>
           </w:p>
           <w:p>
@@ -5640,7 +5922,7 @@
               <w:rPr>
                 <w:sz w:val="18"/>
               </w:rPr>
-              <w:t>Capital goods raise how much can be produced in future, so the curve shifts outwards and more consumer goods become possible later.</w:t>
+              <w:t>It shifts inwards, because capital has been lost, so the maximum output of both goods falls.</w:t>
             </w:r>
           </w:p>
           <w:p>
@@ -5659,7 +5941,7 @@
               <w:rPr>
                 <w:sz w:val="18"/>
               </w:rPr>
-              <w:t>It shifts inwards, because capital has been lost, so the maximum output of both goods falls.</w:t>
+              <w:t>Benefit: more people treated and shorter waits. Cost: the schools and the education they would give.</w:t>
             </w:r>
           </w:p>
           <w:p>
@@ -5678,6 +5960,171 @@
                 <w:sz w:val="18"/>
               </w:rPr>
               <w:t>What to produce, how to produce it, and who gets it.</w:t>
+            </w:r>
+          </w:p>
+        </w:tc>
+      </w:tr>
+    </w:tbl>
+    <w:p>
+      <w:pPr>
+        <w:spacing w:after="6"/>
+        <w:rPr>
+          <w:sz w:val="6"/>
+        </w:rPr>
+      </w:pPr>
+    </w:p>
+    <w:tbl>
+      <w:tblPr>
+        <w:tblStyle w:val="TableGrid"/>
+        <w:tblW w:w="0" w:type="auto"/>
+        <w:tblLayout w:type="fixed"/>
+        <w:tblLook w:val="04A0" w:firstRow="1" w:lastRow="0" w:firstColumn="1" w:lastColumn="0" w:noHBand="0" w:noVBand="1"/>
+      </w:tblPr>
+      <w:tblGrid>
+        <w:gridCol w:w="10103"/>
+      </w:tblGrid>
+      <w:tr>
+        <w:trPr>
+          <w:cantSplit/>
+        </w:trPr>
+        <w:tc>
+          <w:tcPr>
+            <w:tcW w:w="10103" w:type="dxa"/>
+            <w:shd w:val="clear" w:color="auto" w:fill="FAFAFA"/>
+          </w:tcPr>
+          <w:p>
+            <w:pPr>
+              <w:keepNext/>
+              <w:spacing w:after="30" w:line="240" w:lineRule="auto"/>
+            </w:pPr>
+            <w:r>
+              <w:rPr>
+                <w:b/>
+                <w:sz w:val="18"/>
+              </w:rPr>
+              <w:t>GCSE SWAP  2C</w:t>
+            </w:r>
+            <w:r>
+              <w:rPr>
+                <w:sz w:val="18"/>
+              </w:rPr>
+              <w:t xml:space="preserve">  Replace questions 1 to 3 with these. Questions 4 and 5 stay as they are.</w:t>
+            </w:r>
+          </w:p>
+          <w:p>
+            <w:pPr>
+              <w:keepNext/>
+              <w:spacing w:after="10" w:line="240" w:lineRule="auto"/>
+            </w:pPr>
+            <w:r>
+              <w:rPr>
+                <w:b/>
+                <w:sz w:val="18"/>
+              </w:rPr>
+              <w:t xml:space="preserve">(i) </w:t>
+            </w:r>
+            <w:r>
+              <w:rPr>
+                <w:sz w:val="18"/>
+              </w:rPr>
+              <w:t>Name one choice a consumer makes, and state its opportunity cost.</w:t>
+            </w:r>
+          </w:p>
+          <w:p>
+            <w:pPr>
+              <w:keepNext/>
+              <w:spacing w:after="30" w:line="240" w:lineRule="auto"/>
+            </w:pPr>
+            <w:r>
+              <w:rPr>
+                <w:b/>
+                <w:sz w:val="18"/>
+              </w:rPr>
+              <w:t xml:space="preserve">Answer. </w:t>
+            </w:r>
+            <w:r>
+              <w:rPr>
+                <w:i/>
+                <w:sz w:val="18"/>
+              </w:rPr>
+              <w:t>For example £30 on a concert ticket. The opportunity cost is the next best thing that £30 would have bought.</w:t>
+            </w:r>
+          </w:p>
+          <w:p>
+            <w:pPr>
+              <w:keepNext/>
+              <w:spacing w:after="10" w:line="240" w:lineRule="auto"/>
+            </w:pPr>
+            <w:r>
+              <w:rPr>
+                <w:b/>
+                <w:sz w:val="18"/>
+              </w:rPr>
+              <w:t xml:space="preserve">(ii) </w:t>
+            </w:r>
+            <w:r>
+              <w:rPr>
+                <w:sz w:val="18"/>
+              </w:rPr>
+              <w:t>Name one choice a producer makes, and state its opportunity cost.</w:t>
+            </w:r>
+          </w:p>
+          <w:p>
+            <w:pPr>
+              <w:keepNext/>
+              <w:spacing w:after="30" w:line="240" w:lineRule="auto"/>
+            </w:pPr>
+            <w:r>
+              <w:rPr>
+                <w:b/>
+                <w:sz w:val="18"/>
+              </w:rPr>
+              <w:t xml:space="preserve">Answer. </w:t>
+            </w:r>
+            <w:r>
+              <w:rPr>
+                <w:i/>
+                <w:sz w:val="18"/>
+              </w:rPr>
+              <w:t>Using a workshop for chairs. The opportunity cost is the tables the same workers could have made.</w:t>
+            </w:r>
+          </w:p>
+          <w:p>
+            <w:pPr>
+              <w:keepNext/>
+              <w:spacing w:after="10" w:line="240" w:lineRule="auto"/>
+            </w:pPr>
+            <w:r>
+              <w:rPr>
+                <w:b/>
+                <w:sz w:val="18"/>
+              </w:rPr>
+              <w:t xml:space="preserve">(iii) </w:t>
+            </w:r>
+            <w:r>
+              <w:rPr>
+                <w:sz w:val="18"/>
+              </w:rPr>
+              <w:t>A family saves part of its income instead of spending it. Give one benefit and one cost of that choice.</w:t>
+            </w:r>
+          </w:p>
+          <w:p>
+            <w:pPr>
+              <w:spacing w:after="30" w:line="240" w:lineRule="auto"/>
+            </w:pPr>
+            <w:r>
+              <w:rPr>
+                <w:b/>
+                <w:sz w:val="18"/>
+              </w:rPr>
+              <w:t xml:space="preserve">Answer. </w:t>
+            </w:r>
+            <w:r>
+              <w:rPr>
+                <w:i/>
+                <w:sz w:val="18"/>
+              </w:rPr>
+              <w:t>Benefit: money set aside for later, and any interest it earns. Cost: the goods they could have had now.</w:t>
             </w:r>
           </w:p>
         </w:tc>
@@ -5703,7 +6150,7 @@
           <w:sz w:val="25"/>
         </w:rPr>
         <w:lastRenderedPageBreak/>
-        <w:t>WEEK 3. Business: ownership, liability and choosing a structure. Economics: specialisation, money and economic systems.</w:t>
+        <w:t>WEEK 3. Business: ownership, liability and choosing a structure. Economics: specialisation, money, and economic systems at Year 12.</w:t>
       </w:r>
     </w:p>
     <w:p>
@@ -6909,7 +7356,7 @@
               <w:rPr>
                 <w:sz w:val="19"/>
               </w:rPr>
-              <w:t>What does a point outside the production possibility curve show?</w:t>
+              <w:t>Why is opportunity cost not the same thing as the price paid?</w:t>
             </w:r>
           </w:p>
           <w:p>
@@ -7028,7 +7475,7 @@
               <w:rPr>
                 <w:sz w:val="18"/>
               </w:rPr>
-              <w:t>A combination that cannot be reached with current resources and technology. It becomes possible only if the economy grows.</w:t>
+              <w:t>The price is the money handed over. The opportunity cost is what you gave up to have it, which includes things money does not measure, such as time.</w:t>
             </w:r>
           </w:p>
           <w:p>
@@ -7088,7 +7535,7 @@
                 <w:b/>
                 <w:sz w:val="18"/>
               </w:rPr>
-              <w:t>WEEK 3  ·  ECONOMICS  ·  STARTER C      Level: GCSE and Y12</w:t>
+              <w:t>WEEK 3  ·  ECONOMICS  ·  STARTER C      Level: Y12</w:t>
             </w:r>
           </w:p>
           <w:p>
@@ -7177,7 +7624,7 @@
               <w:rPr>
                 <w:sz w:val="19"/>
               </w:rPr>
-              <w:t>What does a point inside the production possibility curve show?</w:t>
+              <w:t>A student stays on at sixth form. State the opportunity cost.</w:t>
             </w:r>
           </w:p>
           <w:p>
@@ -7296,7 +7743,7 @@
               <w:rPr>
                 <w:sz w:val="18"/>
               </w:rPr>
-              <w:t>Resources are not being used fully or efficiently, so there is spare capacity or unemployment.</w:t>
+              <w:t>The wages they would have earned in a job over those two years, and the work experience with them.</w:t>
             </w:r>
           </w:p>
           <w:p>
@@ -7315,6 +7762,171 @@
                 <w:sz w:val="18"/>
               </w:rPr>
               <w:t>What to produce, how to produce it, and who gets it.</w:t>
+            </w:r>
+          </w:p>
+        </w:tc>
+      </w:tr>
+    </w:tbl>
+    <w:p>
+      <w:pPr>
+        <w:spacing w:after="6"/>
+        <w:rPr>
+          <w:sz w:val="6"/>
+        </w:rPr>
+      </w:pPr>
+    </w:p>
+    <w:tbl>
+      <w:tblPr>
+        <w:tblStyle w:val="TableGrid"/>
+        <w:tblW w:w="0" w:type="auto"/>
+        <w:tblLayout w:type="fixed"/>
+        <w:tblLook w:val="04A0" w:firstRow="1" w:lastRow="0" w:firstColumn="1" w:lastColumn="0" w:noHBand="0" w:noVBand="1"/>
+      </w:tblPr>
+      <w:tblGrid>
+        <w:gridCol w:w="10103"/>
+      </w:tblGrid>
+      <w:tr>
+        <w:trPr>
+          <w:cantSplit/>
+        </w:trPr>
+        <w:tc>
+          <w:tcPr>
+            <w:tcW w:w="10103" w:type="dxa"/>
+            <w:shd w:val="clear" w:color="auto" w:fill="FAFAFA"/>
+          </w:tcPr>
+          <w:p>
+            <w:pPr>
+              <w:keepNext/>
+              <w:spacing w:after="30" w:line="240" w:lineRule="auto"/>
+            </w:pPr>
+            <w:r>
+              <w:rPr>
+                <w:b/>
+                <w:sz w:val="18"/>
+              </w:rPr>
+              <w:t>GCSE SWAP  3C</w:t>
+            </w:r>
+            <w:r>
+              <w:rPr>
+                <w:sz w:val="18"/>
+              </w:rPr>
+              <w:t xml:space="preserve">  Replace questions 1 to 3 with these. Questions 4 and 5 stay as they are.</w:t>
+            </w:r>
+          </w:p>
+          <w:p>
+            <w:pPr>
+              <w:keepNext/>
+              <w:spacing w:after="10" w:line="240" w:lineRule="auto"/>
+            </w:pPr>
+            <w:r>
+              <w:rPr>
+                <w:b/>
+                <w:sz w:val="18"/>
+              </w:rPr>
+              <w:t xml:space="preserve">(i) </w:t>
+            </w:r>
+            <w:r>
+              <w:rPr>
+                <w:sz w:val="18"/>
+              </w:rPr>
+              <w:t>Why do producers in the same market compete with each other?</w:t>
+            </w:r>
+          </w:p>
+          <w:p>
+            <w:pPr>
+              <w:keepNext/>
+              <w:spacing w:after="30" w:line="240" w:lineRule="auto"/>
+            </w:pPr>
+            <w:r>
+              <w:rPr>
+                <w:b/>
+                <w:sz w:val="18"/>
+              </w:rPr>
+              <w:t xml:space="preserve">Answer. </w:t>
+            </w:r>
+            <w:r>
+              <w:rPr>
+                <w:i/>
+                <w:sz w:val="18"/>
+              </w:rPr>
+              <w:t>Because customers can buy from a rival instead. A producer competes to win those customers and keep them, and to earn more profit than the firm next door.</w:t>
+            </w:r>
+          </w:p>
+          <w:p>
+            <w:pPr>
+              <w:keepNext/>
+              <w:spacing w:after="10" w:line="240" w:lineRule="auto"/>
+            </w:pPr>
+            <w:r>
+              <w:rPr>
+                <w:b/>
+                <w:sz w:val="18"/>
+              </w:rPr>
+              <w:t xml:space="preserve">(ii) </w:t>
+            </w:r>
+            <w:r>
+              <w:rPr>
+                <w:sz w:val="18"/>
+              </w:rPr>
+              <w:t>How does competition between producers affect the price customers pay?</w:t>
+            </w:r>
+          </w:p>
+          <w:p>
+            <w:pPr>
+              <w:keepNext/>
+              <w:spacing w:after="30" w:line="240" w:lineRule="auto"/>
+            </w:pPr>
+            <w:r>
+              <w:rPr>
+                <w:b/>
+                <w:sz w:val="18"/>
+              </w:rPr>
+              <w:t xml:space="preserve">Answer. </w:t>
+            </w:r>
+            <w:r>
+              <w:rPr>
+                <w:i/>
+                <w:sz w:val="18"/>
+              </w:rPr>
+              <w:t>It pushes it down. If a rival charges less, customers switch, so each producer has to keep its price close to the rest of the market.</w:t>
+            </w:r>
+          </w:p>
+          <w:p>
+            <w:pPr>
+              <w:keepNext/>
+              <w:spacing w:after="10" w:line="240" w:lineRule="auto"/>
+            </w:pPr>
+            <w:r>
+              <w:rPr>
+                <w:b/>
+                <w:sz w:val="18"/>
+              </w:rPr>
+              <w:t xml:space="preserve">(iii) </w:t>
+            </w:r>
+            <w:r>
+              <w:rPr>
+                <w:sz w:val="18"/>
+              </w:rPr>
+              <w:t>What is a monopoly, and name one way it differs from a competitive market.</w:t>
+            </w:r>
+          </w:p>
+          <w:p>
+            <w:pPr>
+              <w:spacing w:after="30" w:line="240" w:lineRule="auto"/>
+            </w:pPr>
+            <w:r>
+              <w:rPr>
+                <w:b/>
+                <w:sz w:val="18"/>
+              </w:rPr>
+              <w:t xml:space="preserve">Answer. </w:t>
+            </w:r>
+            <w:r>
+              <w:rPr>
+                <w:i/>
+                <w:sz w:val="18"/>
+              </w:rPr>
+              <w:t>A market supplied by a single producer. Any one of: the price is higher, the choice is narrower, there is less pressure to improve quality.</w:t>
             </w:r>
           </w:p>
         </w:tc>
@@ -7754,14 +8366,7 @@
                 <w:b/>
                 <w:sz w:val="19"/>
               </w:rPr>
-              <w:t xml:space="preserve">5. </w:t>
-            </w:r>
-            <w:r>
-              <w:rPr>
-                <w:b/>
-                <w:sz w:val="19"/>
-              </w:rPr>
-              <w:t xml:space="preserve">[BACK TO WEEK 2] </w:t>
+              <w:t xml:space="preserve">5. [BACK TO WEEK 2] </w:t>
             </w:r>
             <w:r>
               <w:rPr>
@@ -8821,7 +9426,7 @@
               <w:rPr>
                 <w:sz w:val="19"/>
               </w:rPr>
-              <w:t>Name the three types of economic system.</w:t>
+              <w:t>Define the division of labour.</w:t>
             </w:r>
           </w:p>
           <w:p>
@@ -8840,7 +9445,7 @@
               <w:rPr>
                 <w:sz w:val="19"/>
               </w:rPr>
-              <w:t>What does a point outside the production possibility curve show?</w:t>
+              <w:t>A government spends £2bn on a railway. State the opportunity cost.</w:t>
             </w:r>
           </w:p>
         </w:tc>
@@ -8940,7 +9545,7 @@
               <w:rPr>
                 <w:sz w:val="18"/>
               </w:rPr>
-              <w:t>Free market, command or planned, and mixed.</w:t>
+              <w:t>Splitting a production process into separate tasks and giving each worker one of them.</w:t>
             </w:r>
           </w:p>
           <w:p>
@@ -8958,7 +9563,7 @@
               <w:rPr>
                 <w:sz w:val="18"/>
               </w:rPr>
-              <w:t>A combination that cannot be reached with current resources and technology. It becomes possible only if the economy grows.</w:t>
+              <w:t>The next best use of that £2bn, for example the hospitals or schools it could have built instead.</w:t>
             </w:r>
           </w:p>
         </w:tc>
@@ -10106,7 +10711,7 @@
               <w:rPr>
                 <w:sz w:val="19"/>
               </w:rPr>
-              <w:t>Give one strength and one weakness of a free market.</w:t>
+              <w:t>Give one advantage and one drawback of the division of labour.</w:t>
             </w:r>
           </w:p>
         </w:tc>
@@ -10224,7 +10829,7 @@
               <w:rPr>
                 <w:sz w:val="18"/>
               </w:rPr>
-              <w:t>Strength: prices and profit send resources towards what people actually want. Weakness: anything that is not profitable is underprovided, and the gap between rich and poor tends to widen.</w:t>
+              <w:t>Advantage: workers get faster at a repeated task and output per worker rises. Drawback: the work becomes boring, so motivation and quality fall and staff leave.</w:t>
             </w:r>
           </w:p>
         </w:tc>
@@ -10374,7 +10979,7 @@
               <w:rPr>
                 <w:sz w:val="19"/>
               </w:rPr>
-              <w:t>A country moves production from consumer goods to capital goods. What is the opportunity cost?</w:t>
+              <w:t>Food output falls from 60 to 45 and machinery rises from 20 to 35. State the opportunity cost.</w:t>
             </w:r>
           </w:p>
         </w:tc>
@@ -10492,7 +11097,7 @@
               <w:rPr>
                 <w:sz w:val="18"/>
               </w:rPr>
-              <w:t>The consumer goods given up now, so a lower standard of living in the short term in exchange for more productive capacity later.</w:t>
+              <w:t>15 units of food given up for 15 extra units of machinery. The opportunity cost is 15 units of food.</w:t>
             </w:r>
           </w:p>
         </w:tc>
@@ -14004,7 +14609,7 @@
               <w:rPr>
                 <w:sz w:val="19"/>
               </w:rPr>
-              <w:t>Give one weakness of a free market.</w:t>
+              <w:t>Why can specialisation not work without money?</w:t>
             </w:r>
           </w:p>
         </w:tc>
@@ -14122,7 +14727,7 @@
               <w:rPr>
                 <w:sz w:val="18"/>
               </w:rPr>
-              <w:t>Anything that is not profitable is underprovided, and the gap between rich and poor tends to widen, because income decides who gets what.</w:t>
+              <w:t>Specialists produce one thing and need everything else, so they have to trade. Without money they would have to barter, which only works if each side wants what the other has.</w:t>
             </w:r>
           </w:p>
         </w:tc>
@@ -18845,7 +19450,7 @@
               <w:rPr>
                 <w:sz w:val="20"/>
               </w:rPr>
-              <w:t>What a point inside and a point outside the curve each show</w:t>
+              <w:t>Specialisation and the division of labour, with one benefit and one cost</w:t>
             </w:r>
           </w:p>
         </w:tc>
@@ -19489,31 +20094,31 @@
       </w:rPr>
     </w:lvl>
   </w:abstractNum>
-  <w:num w:numId="1" w16cid:durableId="1170174591">
+  <w:num w:numId="1" w16cid:durableId="1019114130">
     <w:abstractNumId w:val="8"/>
   </w:num>
-  <w:num w:numId="2" w16cid:durableId="446000137">
+  <w:num w:numId="2" w16cid:durableId="1219585023">
     <w:abstractNumId w:val="6"/>
   </w:num>
-  <w:num w:numId="3" w16cid:durableId="582682511">
+  <w:num w:numId="3" w16cid:durableId="410079508">
     <w:abstractNumId w:val="5"/>
   </w:num>
-  <w:num w:numId="4" w16cid:durableId="307563607">
+  <w:num w:numId="4" w16cid:durableId="1126310691">
     <w:abstractNumId w:val="4"/>
   </w:num>
-  <w:num w:numId="5" w16cid:durableId="747919153">
+  <w:num w:numId="5" w16cid:durableId="1236818280">
     <w:abstractNumId w:val="7"/>
   </w:num>
-  <w:num w:numId="6" w16cid:durableId="8679058">
+  <w:num w:numId="6" w16cid:durableId="28263347">
     <w:abstractNumId w:val="3"/>
   </w:num>
-  <w:num w:numId="7" w16cid:durableId="316883839">
+  <w:num w:numId="7" w16cid:durableId="1420367126">
     <w:abstractNumId w:val="2"/>
   </w:num>
-  <w:num w:numId="8" w16cid:durableId="1098864915">
+  <w:num w:numId="8" w16cid:durableId="24211979">
     <w:abstractNumId w:val="1"/>
   </w:num>
-  <w:num w:numId="9" w16cid:durableId="1234774103">
+  <w:num w:numId="9" w16cid:durableId="1321348570">
     <w:abstractNumId w:val="0"/>
   </w:num>
 </w:numbering>

</xml_diff>